<commit_message>
update: week 6 PP2
</commit_message>
<xml_diff>
--- a/WEEK 6/Week6_PP_Final_Fixed.docx
+++ b/WEEK 6/Week6_PP_Final_Fixed.docx
@@ -5950,6 +5950,31 @@
               </w:rPr>
               <w:t xml:space="preserve">2. Python Program (GitHub link): </w:t>
             </w:r>
+            <w:hyperlink r:id="rId8">
+              <w:r>
+                <w:rPr>
+                  <w:rStyle w:val="Hyperlink"/>
+                  <w:rFonts w:eastAsia="Times New Roman" w:cs="Times New Roman" w:ascii="Times New Roman" w:hAnsi="Times New Roman"/>
+                  <w:kern w:val="0"/>
+                  <w:sz w:val="24"/>
+                  <w:szCs w:val="22"/>
+                  <w:lang w:val="en-IN" w:eastAsia="en-US" w:bidi="ar-SA"/>
+                </w:rPr>
+                <w:t>https://github.com/hasnainmakada-99/Data-Science-Codes/blob/main/WEEK%206/Week-6-PP.ipynb</w:t>
+              </w:r>
+            </w:hyperlink>
+            <w:hyperlink r:id="rId9">
+              <w:r>
+                <w:rPr>
+                  <w:rFonts w:eastAsia="Times New Roman" w:cs="Times New Roman" w:ascii="Times New Roman" w:hAnsi="Times New Roman"/>
+                  <w:kern w:val="0"/>
+                  <w:sz w:val="24"/>
+                  <w:szCs w:val="22"/>
+                  <w:lang w:val="en-IN" w:eastAsia="en-US" w:bidi="ar-SA"/>
+                </w:rPr>
+                <w:t xml:space="preserve"> </w:t>
+              </w:r>
+            </w:hyperlink>
           </w:p>
           <w:p>
             <w:pPr>
@@ -5976,7 +6001,7 @@
               </w:rPr>
               <w:t xml:space="preserve">3. Class lecture link: </w:t>
             </w:r>
-            <w:hyperlink r:id="rId8">
+            <w:hyperlink r:id="rId10">
               <w:r>
                 <w:rPr>
                   <w:rStyle w:val="ListLabel91"/>
@@ -6051,12 +6076,12 @@
       </w:r>
     </w:p>
     <w:sectPr>
-      <w:headerReference w:type="even" r:id="rId9"/>
-      <w:headerReference w:type="default" r:id="rId10"/>
-      <w:headerReference w:type="first" r:id="rId11"/>
-      <w:footerReference w:type="even" r:id="rId12"/>
-      <w:footerReference w:type="default" r:id="rId13"/>
-      <w:footerReference w:type="first" r:id="rId14"/>
+      <w:headerReference w:type="even" r:id="rId11"/>
+      <w:headerReference w:type="default" r:id="rId12"/>
+      <w:headerReference w:type="first" r:id="rId13"/>
+      <w:footerReference w:type="even" r:id="rId14"/>
+      <w:footerReference w:type="default" r:id="rId15"/>
+      <w:footerReference w:type="first" r:id="rId16"/>
       <w:type w:val="nextPage"/>
       <w:pgSz w:w="11906" w:h="16838"/>
       <w:pgMar w:left="1440" w:right="1440" w:gutter="0" w:header="708" w:top="1440" w:footer="708" w:bottom="1440"/>

</xml_diff>